<commit_message>
Fix Temple & Webster price note, document Australia Post sources, strengthen QA sheet
</commit_message>
<xml_diff>
--- a/Manoj_Kumar_Assessment_Answers.docx
+++ b/Manoj_Kumar_Assessment_Answers.docx
@@ -193,7 +193,7 @@
                 <w:sz w:val="18"/>
                 <w:szCs w:val="18"/>
               </w:rPr>
-              <w:t xml:space="preserve">Manoj Kumar (mailtomanojkumar07@gmail.com)</w:t>
+              <w:t xml:space="preserve">Manoj Kumar</w:t>
             </w:r>
           </w:p>
         </w:tc>
@@ -2141,7 +2141,7 @@
                 <w:sz w:val="18"/>
                 <w:szCs w:val="18"/>
               </w:rPr>
-              <w:t xml:space="preserve">=IF(E9&gt;=0.35,"Keep","Review") flags any product whose margin is at least 35%. Bedside Table (39.4%) returns "Keep".</w:t>
+              <w:t xml:space="preserve">=IF(Q1_Profit!E9&gt;=0.35,"Keep","Review") flags any product whose margin is at least 35%. Bedside Table (39.4%) returns "Keep".</w:t>
             </w:r>
           </w:p>
         </w:tc>
@@ -2355,7 +2355,7 @@
                 <w:sz w:val="18"/>
                 <w:szCs w:val="18"/>
               </w:rPr>
-              <w:t xml:space="preserve">=VLOOKUP(B6,Q1!A5:C9,3,FALSE) returns the Tool Box selling price ($69). The 3 means the third column, and FALSE forces an exact match.</w:t>
+              <w:t xml:space="preserve">=VLOOKUP(B6,Q1_Profit!$A$5:$C$9,3,FALSE) returns the Tool Box selling price ($69). The 3 means the third column, and FALSE forces an exact match.</w:t>
             </w:r>
           </w:p>
         </w:tc>
@@ -2462,7 +2462,7 @@
                 <w:sz w:val="18"/>
                 <w:szCs w:val="18"/>
               </w:rPr>
-              <w:t xml:space="preserve">=XLOOKUP(B6,Q1!A5:A9,Q1!C5:C9,"Not found") also returns $69. In the workbook I used INDEX/MATCH for the live example so the file works in every Excel version.</w:t>
+              <w:t xml:space="preserve">=XLOOKUP(B6,Q1_Profit!$A$5:$A$9,Q1_Profit!$C$5:$C$9,"Not found") also returns $69. In the workbook I used INDEX/MATCH for the live example so the file works in every Excel version.</w:t>
             </w:r>
           </w:p>
         </w:tc>
@@ -6666,7 +6666,7 @@
                 <w:sz w:val="18"/>
                 <w:szCs w:val="18"/>
               </w:rPr>
-              <w:t xml:space="preserve">Spring peaks in Google Trends. Home &amp; Garden online spend $9.9b in 2025 (+9.9%). Temple &amp; Webster Gordo bed: 4.6 stars, 217 reviews. Bunnings Jack bed: 4.0, 24 reviews.</w:t>
+              <w:t xml:space="preserve">Spring peaks in Google Trends. Home &amp; Garden online spend $9.9b in 2025 (+9.9%, Australia Post category report; see the data conflict note below). Temple &amp; Webster Gordo bed: 4.6 stars, 217 reviews. Bunnings Jack bed: 4.0, 24 reviews.</w:t>
             </w:r>
           </w:p>
         </w:tc>
@@ -6807,7 +6807,7 @@
                 <w:sz w:val="18"/>
                 <w:szCs w:val="18"/>
               </w:rPr>
-              <w:t xml:space="preserve">Bunnings Jack 160x80cm $69; Temple &amp; Webster Gordo $84.95 (was $124)</w:t>
+              <w:t xml:space="preserve">Bunnings Jack 160x80cm $69; Temple &amp; Webster Gordo from $84.95 (its page shows a $84.95 to $124 range across options)</w:t>
             </w:r>
           </w:p>
         </w:tc>
@@ -7219,7 +7219,7 @@
           <w:sz w:val="18"/>
           <w:szCs w:val="18"/>
         </w:rPr>
-        <w:t xml:space="preserve">One data conflict: a press report cites $11.4b for Home &amp; Garden online spend from the main Australia Post report, while Australia Post's own Home &amp; Garden category PDF says $9.9b. They have not been reconciled. The $9.9b figure was read directly on Australia Post's category PDF; the $11.4b figure comes from press coverage and was not checked against the main report.</w:t>
+        <w:t xml:space="preserve">One data conflict: Australia Post's own Home &amp; Garden category PDF says $9.9b online spend in 2025 (+9.9%, credited to CommBank iQ), while three secondary sources (a trade-press article, an IPC news item and an industry blog; links in the appendix) quote $11.4b, and the blog adds +10.5% growth, saying it comes from the main report. I could not reconcile them: the main report itself (p.38) was not opened, and the two figures may use different category definitions. I used $9.9b because I read it on Australia Post's own page. Either figure points the same way (a large category growing at about 10% a year), so the choice does not change the ranking.</w:t>
       </w:r>
     </w:p>
     <w:p>
@@ -8588,7 +8588,7 @@
               <w:spacing w:after="20"/>
               <w:jc w:val="left"/>
             </w:pPr>
-            <w:hyperlink w:history="1" r:id="rIdjjylo94o6t5srwomkegqu">
+            <w:hyperlink w:history="1" r:id="rIdiftbbqb-6nsopj0rjh54k">
               <w:r>
                 <w:rPr>
                   <w:rStyle w:val="Hyperlink"/>
@@ -8730,7 +8730,7 @@
               <w:spacing w:after="20"/>
               <w:jc w:val="left"/>
             </w:pPr>
-            <w:hyperlink w:history="1" r:id="rIdbbasr8czxk_wrpqpn9oyk">
+            <w:hyperlink w:history="1" r:id="rIdkajcafvqnecfoxsksy3il">
               <w:r>
                 <w:rPr>
                   <w:rStyle w:val="Hyperlink"/>
@@ -8812,7 +8812,7 @@
                 <w:sz w:val="18"/>
                 <w:szCs w:val="18"/>
               </w:rPr>
-              <w:t xml:space="preserve">Online spend, growth, households and average basket (total $82.6b in 2025, +14%), plus category reports such as Home &amp; Garden $9.9b and Pet $1.4b; marketplace share; shopper behaviour.</w:t>
+              <w:t xml:space="preserve">Online spend, growth, households and average basket (total $82.6b in 2025, +14%), plus category reports such as Home &amp; Garden $9.9b (a press report gives $11.4b, see Q5 note) and Pet $1.4b; marketplace share; shopper behaviour.</w:t>
             </w:r>
           </w:p>
         </w:tc>
@@ -8872,7 +8872,7 @@
               <w:spacing w:after="20"/>
               <w:jc w:val="left"/>
             </w:pPr>
-            <w:hyperlink w:history="1" r:id="rIdoibn6ecrqv6o53j4kwg0q">
+            <w:hyperlink w:history="1" r:id="rIdpd0tjxzam6t1p1ryj8rph">
               <w:r>
                 <w:rPr>
                   <w:rStyle w:val="Hyperlink"/>
@@ -8890,7 +8890,7 @@
               <w:spacing w:after="20"/>
               <w:jc w:val="left"/>
             </w:pPr>
-            <w:hyperlink w:history="1" r:id="rId6ip2purewqighhwna41nt">
+            <w:hyperlink w:history="1" r:id="rIdpuefkrc4nrrvxoevzh4bo">
               <w:r>
                 <w:rPr>
                   <w:rStyle w:val="Hyperlink"/>
@@ -9032,7 +9032,7 @@
               <w:spacing w:after="20"/>
               <w:jc w:val="left"/>
             </w:pPr>
-            <w:hyperlink w:history="1" r:id="rIddf-wzepwunj8udmxi4mhg">
+            <w:hyperlink w:history="1" r:id="rIdz7sfmrd-h9ip51k_fblog">
               <w:r>
                 <w:rPr>
                   <w:rStyle w:val="Hyperlink"/>
@@ -9174,7 +9174,7 @@
               <w:spacing w:after="20"/>
               <w:jc w:val="left"/>
             </w:pPr>
-            <w:hyperlink w:history="1" r:id="rIdqdpfx2_-0no_prrplfmlo">
+            <w:hyperlink w:history="1" r:id="rIdcuemfs_f2lut-ctlkqtoc">
               <w:r>
                 <w:rPr>
                   <w:rStyle w:val="Hyperlink"/>
@@ -9316,7 +9316,7 @@
               <w:spacing w:after="20"/>
               <w:jc w:val="left"/>
             </w:pPr>
-            <w:hyperlink w:history="1" r:id="rIdsbj-ejiqxqgl6e6iudlku">
+            <w:hyperlink w:history="1" r:id="rIdjickcn2nx6riwphqp15aw">
               <w:r>
                 <w:rPr>
                   <w:rStyle w:val="Hyperlink"/>
@@ -12596,7 +12596,7 @@
         <w:rPr>
           <w:rFonts w:ascii="Arial" w:cs="Arial" w:eastAsia="Arial" w:hAnsi="Arial"/>
         </w:rPr>
-        <w:t xml:space="preserve">I would not pretend a precise list exists. Among the sources checked, none publishes product-level unit sales for the whole market. Each source covers one retailer, one category or spending in general: Amazon AU's Best Sellers pages (rankings, no unit sales), retailer badges such as Kmart's 'Bestseller' (criteria not published; one chair with zero reviews carried it), category spending from Australia Post, and household spending from the ABS.</w:t>
+        <w:t xml:space="preserve">There is no precise list to find. Among the sources checked, none publishes product-level unit sales for the whole market. Each source covers one retailer, one category or spending in general: Amazon AU's Best Sellers pages (rankings, no unit sales), retailer badges such as Kmart's 'Bestseller' (criteria not published; one chair with zero reviews carried it), category spending from Australia Post, and household spending from the ABS.</w:t>
       </w:r>
     </w:p>
     <w:p>
@@ -14293,7 +14293,7 @@
               <w:spacing w:after="20"/>
               <w:jc w:val="left"/>
             </w:pPr>
-            <w:hyperlink w:history="1" r:id="rIdu15yc-hi94mv1yma6jnxa">
+            <w:hyperlink w:history="1" r:id="rIdugn5xdfkhz-py8ofo-vir">
               <w:r>
                 <w:rPr>
                   <w:rStyle w:val="Hyperlink"/>
@@ -14435,7 +14435,7 @@
               <w:spacing w:after="20"/>
               <w:jc w:val="left"/>
             </w:pPr>
-            <w:hyperlink w:history="1" r:id="rIduxhnrly3aby3qicmluq1q">
+            <w:hyperlink w:history="1" r:id="rIdkapz9w4wjbtk_fwprkdks">
               <w:r>
                 <w:rPr>
                   <w:rStyle w:val="Hyperlink"/>
@@ -14577,7 +14577,7 @@
               <w:spacing w:after="20"/>
               <w:jc w:val="left"/>
             </w:pPr>
-            <w:hyperlink w:history="1" r:id="rIdw0zvcfngdqyfwkbathl8d">
+            <w:hyperlink w:history="1" r:id="rIdp_-z2jbzhnilzqmrukzqp">
               <w:r>
                 <w:rPr>
                   <w:rStyle w:val="Hyperlink"/>
@@ -14719,7 +14719,7 @@
               <w:spacing w:after="20"/>
               <w:jc w:val="left"/>
             </w:pPr>
-            <w:hyperlink w:history="1" r:id="rIdi4j-fijvgd-5eo4knojbp">
+            <w:hyperlink w:history="1" r:id="rIdnok1v-27dvkukpe9sxbcc">
               <w:r>
                 <w:rPr>
                   <w:rStyle w:val="Hyperlink"/>
@@ -14861,7 +14861,7 @@
               <w:spacing w:after="20"/>
               <w:jc w:val="left"/>
             </w:pPr>
-            <w:hyperlink w:history="1" r:id="rIdo_waovryx7v1jywqdhmpt">
+            <w:hyperlink w:history="1" r:id="rIdhpfxciffmulofmxuohaxs">
               <w:r>
                 <w:rPr>
                   <w:rStyle w:val="Hyperlink"/>
@@ -15003,7 +15003,7 @@
               <w:spacing w:after="20"/>
               <w:jc w:val="left"/>
             </w:pPr>
-            <w:hyperlink w:history="1" r:id="rId29vsbaqlci56qu7uqutji">
+            <w:hyperlink w:history="1" r:id="rIddvaggpc963tbh5cqolzmb">
               <w:r>
                 <w:rPr>
                   <w:rStyle w:val="Hyperlink"/>
@@ -15145,7 +15145,7 @@
               <w:spacing w:after="20"/>
               <w:jc w:val="left"/>
             </w:pPr>
-            <w:hyperlink w:history="1" r:id="rIdgfu2yxdtfe31fq-a2aurn">
+            <w:hyperlink w:history="1" r:id="rIdtyy2jcdbmto3hd_ym14lj">
               <w:r>
                 <w:rPr>
                   <w:rStyle w:val="Hyperlink"/>
@@ -15287,7 +15287,7 @@
               <w:spacing w:after="20"/>
               <w:jc w:val="left"/>
             </w:pPr>
-            <w:hyperlink w:history="1" r:id="rIdee4n6w8q7huajna8jveey">
+            <w:hyperlink w:history="1" r:id="rIduc13uszrew8jzvb9k4qeo">
               <w:r>
                 <w:rPr>
                   <w:rStyle w:val="Hyperlink"/>
@@ -15429,7 +15429,7 @@
               <w:spacing w:after="20"/>
               <w:jc w:val="left"/>
             </w:pPr>
-            <w:hyperlink w:history="1" r:id="rId4p_urgjkyqymxs11frf9j">
+            <w:hyperlink w:history="1" r:id="rIdjsyjcgitfl-y-efnuxers">
               <w:r>
                 <w:rPr>
                   <w:rStyle w:val="Hyperlink"/>
@@ -15571,7 +15571,7 @@
               <w:spacing w:after="20"/>
               <w:jc w:val="left"/>
             </w:pPr>
-            <w:hyperlink w:history="1" r:id="rIdtflvy_cqi_ka8pyjlach1">
+            <w:hyperlink w:history="1" r:id="rIdj6i_5krphlfnfuvew0hom">
               <w:r>
                 <w:rPr>
                   <w:rStyle w:val="Hyperlink"/>
@@ -15713,7 +15713,7 @@
               <w:spacing w:after="20"/>
               <w:jc w:val="left"/>
             </w:pPr>
-            <w:hyperlink w:history="1" r:id="rIdsd_h4_glsiilusalvtu04">
+            <w:hyperlink w:history="1" r:id="rIdwuajerlhbwc_60za3h7fx">
               <w:r>
                 <w:rPr>
                   <w:rStyle w:val="Hyperlink"/>
@@ -15855,7 +15855,7 @@
               <w:spacing w:after="20"/>
               <w:jc w:val="left"/>
             </w:pPr>
-            <w:hyperlink w:history="1" r:id="rIddtjzyja7idx10amb8zanr">
+            <w:hyperlink w:history="1" r:id="rIdnvncehwzsirzz3sfz-m8_">
               <w:r>
                 <w:rPr>
                   <w:rStyle w:val="Hyperlink"/>
@@ -15997,7 +15997,7 @@
               <w:spacing w:after="20"/>
               <w:jc w:val="left"/>
             </w:pPr>
-            <w:hyperlink w:history="1" r:id="rIdqaswzokc5tsrviyxpfdqw">
+            <w:hyperlink w:history="1" r:id="rIdhwxdtm899r-603n80ylei">
               <w:r>
                 <w:rPr>
                   <w:rStyle w:val="Hyperlink"/>
@@ -16139,7 +16139,7 @@
               <w:spacing w:after="20"/>
               <w:jc w:val="left"/>
             </w:pPr>
-            <w:hyperlink w:history="1" r:id="rIdrx5phvzanqpxoldzeae3t">
+            <w:hyperlink w:history="1" r:id="rIdivnxuwipk7cdcemq9uhc0">
               <w:r>
                 <w:rPr>
                   <w:rStyle w:val="Hyperlink"/>
@@ -16281,7 +16281,7 @@
               <w:spacing w:after="20"/>
               <w:jc w:val="left"/>
             </w:pPr>
-            <w:hyperlink w:history="1" r:id="rIdnow0-dnxh2_ggno7vzw-r">
+            <w:hyperlink w:history="1" r:id="rIdpevqbp5gp_m1k9vqo3wic">
               <w:r>
                 <w:rPr>
                   <w:rStyle w:val="Hyperlink"/>
@@ -16469,7 +16469,7 @@
               <w:spacing w:after="20"/>
               <w:jc w:val="left"/>
             </w:pPr>
-            <w:hyperlink w:history="1" r:id="rIdx1jfptb4hdzt5rkn9zkgu">
+            <w:hyperlink w:history="1" r:id="rIdurjfvy4gn_xn5g5lggeu8">
               <w:r>
                 <w:rPr>
                   <w:rStyle w:val="Hyperlink"/>
@@ -16543,7 +16543,7 @@
               <w:spacing w:after="20"/>
               <w:jc w:val="left"/>
             </w:pPr>
-            <w:hyperlink w:history="1" r:id="rIduqbzxga27aprqb-uxem3k">
+            <w:hyperlink w:history="1" r:id="rIdzzcnhxbavm1fj1xu48hyp">
               <w:r>
                 <w:rPr>
                   <w:rStyle w:val="Hyperlink"/>
@@ -16617,7 +16617,7 @@
               <w:spacing w:after="20"/>
               <w:jc w:val="left"/>
             </w:pPr>
-            <w:hyperlink w:history="1" r:id="rIdmv96gsnmn7y6gd7xmbqdx">
+            <w:hyperlink w:history="1" r:id="rIdhnfw2j0lhvndnlra-_f_j">
               <w:r>
                 <w:rPr>
                   <w:rStyle w:val="Hyperlink"/>
@@ -16691,7 +16691,7 @@
               <w:spacing w:after="20"/>
               <w:jc w:val="left"/>
             </w:pPr>
-            <w:hyperlink w:history="1" r:id="rIdlwpthflthdtnzjjhdrqca">
+            <w:hyperlink w:history="1" r:id="rIdprkajrkdsfgtipozdzhjw">
               <w:r>
                 <w:rPr>
                   <w:rStyle w:val="Hyperlink"/>
@@ -16765,7 +16765,7 @@
               <w:spacing w:after="20"/>
               <w:jc w:val="left"/>
             </w:pPr>
-            <w:hyperlink w:history="1" r:id="rIdn-lnw6kg2dqos1owgshwm">
+            <w:hyperlink w:history="1" r:id="rIdq9lgnkpw55mpbubdosl-g">
               <w:r>
                 <w:rPr>
                   <w:rStyle w:val="Hyperlink"/>
@@ -16839,7 +16839,7 @@
               <w:spacing w:after="20"/>
               <w:jc w:val="left"/>
             </w:pPr>
-            <w:hyperlink w:history="1" r:id="rIdq1uk5xeoc_ffqq9akkwf4">
+            <w:hyperlink w:history="1" r:id="rId1usq_jf1vdtnphqd2-7mr">
               <w:r>
                 <w:rPr>
                   <w:rStyle w:val="Hyperlink"/>
@@ -16913,7 +16913,7 @@
               <w:spacing w:after="20"/>
               <w:jc w:val="left"/>
             </w:pPr>
-            <w:hyperlink w:history="1" r:id="rIdkugytmroztcczlcp1i4dy">
+            <w:hyperlink w:history="1" r:id="rId9ec5cypwtufohf0ytjhzw">
               <w:r>
                 <w:rPr>
                   <w:rStyle w:val="Hyperlink"/>
@@ -16987,7 +16987,7 @@
               <w:spacing w:after="20"/>
               <w:jc w:val="left"/>
             </w:pPr>
-            <w:hyperlink w:history="1" r:id="rIdjxwxysa2mgbl2myjtdwj2">
+            <w:hyperlink w:history="1" r:id="rIdt756jza4n47pkdatujx2r">
               <w:r>
                 <w:rPr>
                   <w:rStyle w:val="Hyperlink"/>
@@ -17061,7 +17061,7 @@
               <w:spacing w:after="20"/>
               <w:jc w:val="left"/>
             </w:pPr>
-            <w:hyperlink w:history="1" r:id="rIdwnenbqh3hid-ds3czp55z">
+            <w:hyperlink w:history="1" r:id="rIdg-aefeeh8gn0mzoi-fzrc">
               <w:r>
                 <w:rPr>
                   <w:rStyle w:val="Hyperlink"/>
@@ -17135,7 +17135,7 @@
               <w:spacing w:after="20"/>
               <w:jc w:val="left"/>
             </w:pPr>
-            <w:hyperlink w:history="1" r:id="rIdhvh7qe964eu_xccktskkp">
+            <w:hyperlink w:history="1" r:id="rIdowa_k-gyiih13k3berqe9">
               <w:r>
                 <w:rPr>
                   <w:rStyle w:val="Hyperlink"/>
@@ -17209,7 +17209,7 @@
               <w:spacing w:after="20"/>
               <w:jc w:val="left"/>
             </w:pPr>
-            <w:hyperlink w:history="1" r:id="rIdv5abghzoeqqn70dxvpoyo">
+            <w:hyperlink w:history="1" r:id="rId_hi6aguiecgaehdxc0j1t">
               <w:r>
                 <w:rPr>
                   <w:rStyle w:val="Hyperlink"/>
@@ -17218,6 +17218,228 @@
                   <w:szCs w:val="16"/>
                 </w:rPr>
                 <w:t xml:space="preserve">https://www.bunnings.com.au/products/outdoor-living/outdoor-furniture/outdoor-storage/outdoor-storage-boxes</w:t>
+              </w:r>
+            </w:hyperlink>
+          </w:p>
+        </w:tc>
+      </w:tr>
+      <w:tr>
+        <w:trPr>
+          <w:cantSplit/>
+        </w:trPr>
+        <w:tc>
+          <w:tcPr>
+            <w:tcW w:type="dxa" w:w="2600"/>
+            <w:tcBorders>
+              <w:top w:val="single" w:color="BFBFBF" w:sz="4"/>
+              <w:left w:val="single" w:color="BFBFBF" w:sz="4"/>
+              <w:bottom w:val="single" w:color="BFBFBF" w:sz="4"/>
+              <w:right w:val="single" w:color="BFBFBF" w:sz="4"/>
+            </w:tcBorders>
+            <w:tcMar>
+              <w:top w:type="dxa" w:w="50"/>
+              <w:left w:type="dxa" w:w="90"/>
+              <w:bottom w:type="dxa" w:w="50"/>
+              <w:right w:type="dxa" w:w="90"/>
+            </w:tcMar>
+          </w:tcPr>
+          <w:p>
+            <w:pPr>
+              <w:keepNext w:val="false"/>
+              <w:spacing w:after="20"/>
+              <w:jc w:val="left"/>
+            </w:pPr>
+            <w:r>
+              <w:rPr>
+                <w:rFonts w:ascii="Arial" w:cs="Arial" w:eastAsia="Arial" w:hAnsi="Arial"/>
+                <w:b w:val="false"/>
+                <w:bCs w:val="false"/>
+                <w:sz w:val="18"/>
+                <w:szCs w:val="18"/>
+              </w:rPr>
+              <w:t xml:space="preserve">Press quoting Home &amp; Garden $11.4b: Parcel &amp; Postal Technology International</w:t>
+            </w:r>
+          </w:p>
+        </w:tc>
+        <w:tc>
+          <w:tcPr>
+            <w:tcW w:type="dxa" w:w="6426"/>
+            <w:tcBorders>
+              <w:top w:val="single" w:color="BFBFBF" w:sz="4"/>
+              <w:left w:val="single" w:color="BFBFBF" w:sz="4"/>
+              <w:bottom w:val="single" w:color="BFBFBF" w:sz="4"/>
+              <w:right w:val="single" w:color="BFBFBF" w:sz="4"/>
+            </w:tcBorders>
+            <w:tcMar>
+              <w:top w:type="dxa" w:w="50"/>
+              <w:left w:type="dxa" w:w="90"/>
+              <w:bottom w:type="dxa" w:w="50"/>
+              <w:right w:type="dxa" w:w="90"/>
+            </w:tcMar>
+          </w:tcPr>
+          <w:p>
+            <w:pPr>
+              <w:keepNext w:val="false"/>
+              <w:spacing w:after="20"/>
+              <w:jc w:val="left"/>
+            </w:pPr>
+            <w:hyperlink w:history="1" r:id="rIdo_jxkd22wqwjsic5_19a1">
+              <w:r>
+                <w:rPr>
+                  <w:rStyle w:val="Hyperlink"/>
+                  <w:rFonts w:ascii="Arial" w:cs="Arial" w:eastAsia="Arial" w:hAnsi="Arial"/>
+                  <w:sz w:val="16"/>
+                  <w:szCs w:val="16"/>
+                </w:rPr>
+                <w:t xml:space="preserve">https://www.parcelandpostaltechnologyinternational.com/news/e-commerce/australian-online-spending-reaches-a82-6bn-in-2025.html</w:t>
+              </w:r>
+            </w:hyperlink>
+          </w:p>
+        </w:tc>
+      </w:tr>
+      <w:tr>
+        <w:trPr>
+          <w:cantSplit/>
+        </w:trPr>
+        <w:tc>
+          <w:tcPr>
+            <w:tcW w:type="dxa" w:w="2600"/>
+            <w:tcBorders>
+              <w:top w:val="single" w:color="BFBFBF" w:sz="4"/>
+              <w:left w:val="single" w:color="BFBFBF" w:sz="4"/>
+              <w:bottom w:val="single" w:color="BFBFBF" w:sz="4"/>
+              <w:right w:val="single" w:color="BFBFBF" w:sz="4"/>
+            </w:tcBorders>
+            <w:tcMar>
+              <w:top w:type="dxa" w:w="50"/>
+              <w:left w:type="dxa" w:w="90"/>
+              <w:bottom w:type="dxa" w:w="50"/>
+              <w:right w:type="dxa" w:w="90"/>
+            </w:tcMar>
+          </w:tcPr>
+          <w:p>
+            <w:pPr>
+              <w:keepNext w:val="false"/>
+              <w:spacing w:after="20"/>
+              <w:jc w:val="left"/>
+            </w:pPr>
+            <w:r>
+              <w:rPr>
+                <w:rFonts w:ascii="Arial" w:cs="Arial" w:eastAsia="Arial" w:hAnsi="Arial"/>
+                <w:b w:val="false"/>
+                <w:bCs w:val="false"/>
+                <w:sz w:val="18"/>
+                <w:szCs w:val="18"/>
+              </w:rPr>
+              <w:t xml:space="preserve">Press quoting Home &amp; Garden $11.4b: IPC</w:t>
+            </w:r>
+          </w:p>
+        </w:tc>
+        <w:tc>
+          <w:tcPr>
+            <w:tcW w:type="dxa" w:w="6426"/>
+            <w:tcBorders>
+              <w:top w:val="single" w:color="BFBFBF" w:sz="4"/>
+              <w:left w:val="single" w:color="BFBFBF" w:sz="4"/>
+              <w:bottom w:val="single" w:color="BFBFBF" w:sz="4"/>
+              <w:right w:val="single" w:color="BFBFBF" w:sz="4"/>
+            </w:tcBorders>
+            <w:tcMar>
+              <w:top w:type="dxa" w:w="50"/>
+              <w:left w:type="dxa" w:w="90"/>
+              <w:bottom w:type="dxa" w:w="50"/>
+              <w:right w:type="dxa" w:w="90"/>
+            </w:tcMar>
+          </w:tcPr>
+          <w:p>
+            <w:pPr>
+              <w:keepNext w:val="false"/>
+              <w:spacing w:after="20"/>
+              <w:jc w:val="left"/>
+            </w:pPr>
+            <w:hyperlink w:history="1" r:id="rIduv0x5zjn2ip-bqllm8muu">
+              <w:r>
+                <w:rPr>
+                  <w:rStyle w:val="Hyperlink"/>
+                  <w:rFonts w:ascii="Arial" w:cs="Arial" w:eastAsia="Arial" w:hAnsi="Arial"/>
+                  <w:sz w:val="16"/>
+                  <w:szCs w:val="16"/>
+                </w:rPr>
+                <w:t xml:space="preserve">https://www.ipc.be/news-portal/e-commerce/2026/03/18/16/03/aussies-add-82-6-billion-to-cart</w:t>
+              </w:r>
+            </w:hyperlink>
+          </w:p>
+        </w:tc>
+      </w:tr>
+      <w:tr>
+        <w:trPr>
+          <w:cantSplit/>
+        </w:trPr>
+        <w:tc>
+          <w:tcPr>
+            <w:tcW w:type="dxa" w:w="2600"/>
+            <w:tcBorders>
+              <w:top w:val="single" w:color="BFBFBF" w:sz="4"/>
+              <w:left w:val="single" w:color="BFBFBF" w:sz="4"/>
+              <w:bottom w:val="single" w:color="BFBFBF" w:sz="4"/>
+              <w:right w:val="single" w:color="BFBFBF" w:sz="4"/>
+            </w:tcBorders>
+            <w:tcMar>
+              <w:top w:type="dxa" w:w="50"/>
+              <w:left w:type="dxa" w:w="90"/>
+              <w:bottom w:type="dxa" w:w="50"/>
+              <w:right w:type="dxa" w:w="90"/>
+            </w:tcMar>
+          </w:tcPr>
+          <w:p>
+            <w:pPr>
+              <w:keepNext w:val="false"/>
+              <w:spacing w:after="20"/>
+              <w:jc w:val="left"/>
+            </w:pPr>
+            <w:r>
+              <w:rPr>
+                <w:rFonts w:ascii="Arial" w:cs="Arial" w:eastAsia="Arial" w:hAnsi="Arial"/>
+                <w:b w:val="false"/>
+                <w:bCs w:val="false"/>
+                <w:sz w:val="18"/>
+                <w:szCs w:val="18"/>
+              </w:rPr>
+              <w:t xml:space="preserve">Blog quoting $11.4b (+10.5%): eightx.co</w:t>
+            </w:r>
+          </w:p>
+        </w:tc>
+        <w:tc>
+          <w:tcPr>
+            <w:tcW w:type="dxa" w:w="6426"/>
+            <w:tcBorders>
+              <w:top w:val="single" w:color="BFBFBF" w:sz="4"/>
+              <w:left w:val="single" w:color="BFBFBF" w:sz="4"/>
+              <w:bottom w:val="single" w:color="BFBFBF" w:sz="4"/>
+              <w:right w:val="single" w:color="BFBFBF" w:sz="4"/>
+            </w:tcBorders>
+            <w:tcMar>
+              <w:top w:type="dxa" w:w="50"/>
+              <w:left w:type="dxa" w:w="90"/>
+              <w:bottom w:type="dxa" w:w="50"/>
+              <w:right w:type="dxa" w:w="90"/>
+            </w:tcMar>
+          </w:tcPr>
+          <w:p>
+            <w:pPr>
+              <w:keepNext w:val="false"/>
+              <w:spacing w:after="20"/>
+              <w:jc w:val="left"/>
+            </w:pPr>
+            <w:hyperlink w:history="1" r:id="rId_meirc-smao1jqgxnrpkv">
+              <w:r>
+                <w:rPr>
+                  <w:rStyle w:val="Hyperlink"/>
+                  <w:rFonts w:ascii="Arial" w:cs="Arial" w:eastAsia="Arial" w:hAnsi="Arial"/>
+                  <w:sz w:val="16"/>
+                  <w:szCs w:val="16"/>
+                </w:rPr>
+                <w:t xml:space="preserve">https://eightx.co/blog/australian-online-retail-category-share-2026</w:t>
               </w:r>
             </w:hyperlink>
           </w:p>

</xml_diff>

<commit_message>
Update answers and workbook after final audit
</commit_message>
<xml_diff>
--- a/Manoj_Kumar_Assessment_Answers.docx
+++ b/Manoj_Kumar_Assessment_Answers.docx
@@ -1657,7 +1657,7 @@
         <w:rPr>
           <w:rFonts w:ascii="Arial" w:cs="Arial" w:eastAsia="Arial" w:hAnsi="Arial"/>
         </w:rPr>
-        <w:t xml:space="preserve"> the Bedside Table first. It has the best margin by a clear gap (the next best is Tool Box at 34.8%), it ties up the least cash per unit ($60), and the $99 price point is easier to sell than $219. The Garden Table earns the most dollars per sale ($69) but has the lowest margin (31.5%) and costs $150 to stock, so I would keep it as the second priority rather than the lead.</w:t>
+        <w:t xml:space="preserve"> the Bedside Table first. It has the best margin by a clear gap (the next best is Tool Box at 34.8%), it needs only $60 of cash per unit (the Garden Table needs $150), and a $99 product is probably easier to sell than a $219 one. The Garden Table earns the most dollars per sale ($69) but has the lowest margin (31.5%) and costs $150 to stock, so I would keep it as the second priority rather than the lead.</w:t>
       </w:r>
     </w:p>
     <w:p>
@@ -4951,7 +4951,7 @@
           </w:tcPr>
           <w:p>
             <w:pPr>
-              <w:keepNext w:val="false"/>
+              <w:keepNext/>
               <w:spacing w:after="20"/>
               <w:jc w:val="left"/>
             </w:pPr>
@@ -4985,7 +4985,7 @@
           </w:tcPr>
           <w:p>
             <w:pPr>
-              <w:keepNext w:val="false"/>
+              <w:keepNext/>
               <w:spacing w:after="20"/>
               <w:jc w:val="left"/>
             </w:pPr>
@@ -5019,7 +5019,7 @@
           </w:tcPr>
           <w:p>
             <w:pPr>
-              <w:keepNext w:val="false"/>
+              <w:keepNext/>
               <w:spacing w:after="20"/>
               <w:jc w:val="left"/>
             </w:pPr>
@@ -5053,7 +5053,7 @@
           </w:tcPr>
           <w:p>
             <w:pPr>
-              <w:keepNext w:val="false"/>
+              <w:keepNext/>
               <w:spacing w:after="20"/>
               <w:jc w:val="left"/>
             </w:pPr>
@@ -5087,7 +5087,7 @@
           </w:tcPr>
           <w:p>
             <w:pPr>
-              <w:keepNext w:val="false"/>
+              <w:keepNext/>
               <w:spacing w:after="20"/>
               <w:jc w:val="left"/>
             </w:pPr>
@@ -5126,7 +5126,7 @@
           </w:tcPr>
           <w:p>
             <w:pPr>
-              <w:keepNext w:val="false"/>
+              <w:keepNext/>
               <w:spacing w:after="20"/>
               <w:jc w:val="left"/>
             </w:pPr>
@@ -5160,7 +5160,7 @@
           </w:tcPr>
           <w:p>
             <w:pPr>
-              <w:keepNext w:val="false"/>
+              <w:keepNext/>
               <w:spacing w:after="20"/>
               <w:jc w:val="left"/>
             </w:pPr>
@@ -5194,7 +5194,7 @@
           </w:tcPr>
           <w:p>
             <w:pPr>
-              <w:keepNext w:val="false"/>
+              <w:keepNext/>
               <w:spacing w:after="20"/>
               <w:jc w:val="left"/>
             </w:pPr>
@@ -5228,7 +5228,7 @@
           </w:tcPr>
           <w:p>
             <w:pPr>
-              <w:keepNext w:val="false"/>
+              <w:keepNext/>
               <w:spacing w:after="20"/>
               <w:jc w:val="left"/>
             </w:pPr>
@@ -5262,7 +5262,7 @@
           </w:tcPr>
           <w:p>
             <w:pPr>
-              <w:keepNext w:val="false"/>
+              <w:keepNext/>
               <w:spacing w:after="20"/>
               <w:jc w:val="left"/>
             </w:pPr>
@@ -5301,7 +5301,7 @@
           </w:tcPr>
           <w:p>
             <w:pPr>
-              <w:keepNext w:val="false"/>
+              <w:keepNext/>
               <w:spacing w:after="20"/>
               <w:jc w:val="left"/>
             </w:pPr>
@@ -5335,7 +5335,7 @@
           </w:tcPr>
           <w:p>
             <w:pPr>
-              <w:keepNext w:val="false"/>
+              <w:keepNext/>
               <w:spacing w:after="20"/>
               <w:jc w:val="left"/>
             </w:pPr>
@@ -5369,7 +5369,7 @@
           </w:tcPr>
           <w:p>
             <w:pPr>
-              <w:keepNext w:val="false"/>
+              <w:keepNext/>
               <w:spacing w:after="20"/>
               <w:jc w:val="left"/>
             </w:pPr>
@@ -5403,7 +5403,7 @@
           </w:tcPr>
           <w:p>
             <w:pPr>
-              <w:keepNext w:val="false"/>
+              <w:keepNext/>
               <w:spacing w:after="20"/>
               <w:jc w:val="left"/>
             </w:pPr>
@@ -5437,7 +5437,7 @@
           </w:tcPr>
           <w:p>
             <w:pPr>
-              <w:keepNext w:val="false"/>
+              <w:keepNext/>
               <w:spacing w:after="20"/>
               <w:jc w:val="left"/>
             </w:pPr>
@@ -5919,7 +5919,7 @@
           </w:tcPr>
           <w:p>
             <w:pPr>
-              <w:keepNext w:val="false"/>
+              <w:keepNext/>
               <w:spacing w:after="20"/>
               <w:jc w:val="left"/>
             </w:pPr>
@@ -5944,7 +5944,7 @@
           </w:tcPr>
           <w:p>
             <w:pPr>
-              <w:keepNext w:val="false"/>
+              <w:keepNext/>
               <w:spacing w:after="20"/>
               <w:jc w:val="left"/>
             </w:pPr>
@@ -5980,7 +5980,7 @@
           </w:tcPr>
           <w:p>
             <w:pPr>
-              <w:keepNext w:val="false"/>
+              <w:keepNext/>
               <w:spacing w:after="20"/>
               <w:jc w:val="left"/>
             </w:pPr>
@@ -6016,7 +6016,7 @@
           </w:tcPr>
           <w:p>
             <w:pPr>
-              <w:keepNext w:val="false"/>
+              <w:keepNext/>
               <w:spacing w:after="20"/>
               <w:jc w:val="left"/>
             </w:pPr>
@@ -6056,7 +6056,7 @@
           </w:tcPr>
           <w:p>
             <w:pPr>
-              <w:keepNext w:val="false"/>
+              <w:keepNext/>
               <w:spacing w:after="20"/>
               <w:jc w:val="left"/>
             </w:pPr>
@@ -6090,7 +6090,7 @@
           </w:tcPr>
           <w:p>
             <w:pPr>
-              <w:keepNext w:val="false"/>
+              <w:keepNext/>
               <w:spacing w:after="20"/>
               <w:jc w:val="left"/>
             </w:pPr>
@@ -6124,7 +6124,7 @@
           </w:tcPr>
           <w:p>
             <w:pPr>
-              <w:keepNext w:val="false"/>
+              <w:keepNext/>
               <w:spacing w:after="20"/>
               <w:jc w:val="left"/>
             </w:pPr>
@@ -6158,7 +6158,7 @@
           </w:tcPr>
           <w:p>
             <w:pPr>
-              <w:keepNext w:val="false"/>
+              <w:keepNext/>
               <w:spacing w:after="20"/>
               <w:jc w:val="left"/>
             </w:pPr>
@@ -6197,7 +6197,7 @@
           </w:tcPr>
           <w:p>
             <w:pPr>
-              <w:keepNext w:val="false"/>
+              <w:keepNext/>
               <w:spacing w:after="20"/>
               <w:jc w:val="left"/>
             </w:pPr>
@@ -6231,7 +6231,7 @@
           </w:tcPr>
           <w:p>
             <w:pPr>
-              <w:keepNext w:val="false"/>
+              <w:keepNext/>
               <w:spacing w:after="20"/>
               <w:jc w:val="left"/>
             </w:pPr>
@@ -6265,7 +6265,7 @@
           </w:tcPr>
           <w:p>
             <w:pPr>
-              <w:keepNext w:val="false"/>
+              <w:keepNext/>
               <w:spacing w:after="20"/>
               <w:jc w:val="left"/>
             </w:pPr>
@@ -6299,7 +6299,7 @@
           </w:tcPr>
           <w:p>
             <w:pPr>
-              <w:keepNext w:val="false"/>
+              <w:keepNext/>
               <w:spacing w:after="20"/>
               <w:jc w:val="left"/>
             </w:pPr>
@@ -6338,7 +6338,7 @@
           </w:tcPr>
           <w:p>
             <w:pPr>
-              <w:keepNext w:val="false"/>
+              <w:keepNext/>
               <w:spacing w:after="20"/>
               <w:jc w:val="left"/>
             </w:pPr>
@@ -6372,7 +6372,7 @@
           </w:tcPr>
           <w:p>
             <w:pPr>
-              <w:keepNext w:val="false"/>
+              <w:keepNext/>
               <w:spacing w:after="20"/>
               <w:jc w:val="left"/>
             </w:pPr>
@@ -6406,7 +6406,7 @@
           </w:tcPr>
           <w:p>
             <w:pPr>
-              <w:keepNext w:val="false"/>
+              <w:keepNext/>
               <w:spacing w:after="20"/>
               <w:jc w:val="left"/>
             </w:pPr>
@@ -6440,7 +6440,7 @@
           </w:tcPr>
           <w:p>
             <w:pPr>
-              <w:keepNext w:val="false"/>
+              <w:keepNext/>
               <w:spacing w:after="20"/>
               <w:jc w:val="left"/>
             </w:pPr>
@@ -12861,7 +12861,7 @@
         <w:rPr>
           <w:rFonts w:ascii="Arial" w:cs="Arial" w:eastAsia="Arial" w:hAnsi="Arial"/>
         </w:rPr>
-        <w:t xml:space="preserve"> Split the work: roughly 45 minutes learning, 30 minutes practising, 2 hours building the report, and 45 minutes checking it. Confirm the data and what the report must show.</w:t>
+        <w:t xml:space="preserve"> Assuming about four hours of working time, I would split the work: roughly 45 minutes learning, 30 minutes practising, 1 hour 45 minutes building the report, and 45 minutes checking it. Confirm the data and what the report must show.</w:t>
       </w:r>
     </w:p>
     <w:p>
@@ -13958,7 +13958,8 @@
     <w:p>
       <w:pPr>
         <w:pStyle w:val="Heading1"/>
-        <w:spacing w:after="140" w:before="320"/>
+        <w:pageBreakBefore/>
+        <w:spacing w:after="140" w:before="0"/>
       </w:pPr>
       <w:r>
         <w:rPr>
@@ -14551,7 +14552,7 @@
                 <w:sz w:val="18"/>
                 <w:szCs w:val="18"/>
               </w:rPr>
-              <w:t xml:space="preserve">Alfordson Mesh Office Chair Executive Seat Til...</w:t>
+              <w:t xml:space="preserve">Alfordson Mesh Office Chair Executive Seat Tilt Gaming Racing Computer - Grey</w:t>
             </w:r>
           </w:p>
         </w:tc>
@@ -15261,7 +15262,7 @@
                 <w:sz w:val="18"/>
                 <w:szCs w:val="18"/>
               </w:rPr>
-              <w:t xml:space="preserve">ALFORDSON Velvet Office Chair for Work Mid Bac...</w:t>
+              <w:t xml:space="preserve">ALFORDSON Velvet Office Chair for Work Mid Back Grey</w:t>
             </w:r>
           </w:p>
         </w:tc>
@@ -15403,7 +15404,7 @@
                 <w:sz w:val="18"/>
                 <w:szCs w:val="18"/>
               </w:rPr>
-              <w:t xml:space="preserve">ALFORDSON Mesh Office Chair Racing Ergonomic C...</w:t>
+              <w:t xml:space="preserve">ALFORDSON Mesh Office Chair Racing Ergonomic Computer Chair All Black</w:t>
             </w:r>
           </w:p>
         </w:tc>
@@ -15545,7 +15546,7 @@
                 <w:sz w:val="18"/>
                 <w:szCs w:val="18"/>
               </w:rPr>
-              <w:t xml:space="preserve">Ergolux Plus Ergonomic Mesh Office Chair with ...</w:t>
+              <w:t xml:space="preserve">Ergolux Plus Ergonomic Mesh Office Chair with Footrest (Black)</w:t>
             </w:r>
           </w:p>
         </w:tc>
@@ -15829,7 +15830,7 @@
                 <w:sz w:val="18"/>
                 <w:szCs w:val="18"/>
               </w:rPr>
-              <w:t xml:space="preserve">Levede Adjustable Armrest Office Mesh Gaming C...</w:t>
+              <w:t xml:space="preserve">Levede Adjustable Armrest Office Mesh Gaming Chair Recliner</w:t>
             </w:r>
           </w:p>
         </w:tc>

</xml_diff>